<commit_message>
Added new tab to generate report Change to dropdown list model type and risk. Adjust landing page Additional information in both tables.
</commit_message>
<xml_diff>
--- a/tab1_landing_page_intro.docx
+++ b/tab1_landing_page_intro.docx
@@ -79,13 +79,16 @@
     </w:p>
     <w:p>
       <w:pPr>
-        <w:rPr>
-          <w:sz w:val="24"/>
-          <w:szCs w:val="24"/>
-        </w:rPr>
-      </w:pPr>
-      <w:r>
-        <w:rPr>
+        <w:jc w:val="both"/>
+        <w:rPr>
+          <w:rFonts w:ascii="Roboto" w:cs="Roboto" w:eastAsia="Roboto" w:hAnsi="Roboto"/>
+          <w:sz w:val="24"/>
+          <w:szCs w:val="24"/>
+        </w:rPr>
+      </w:pPr>
+      <w:r>
+        <w:rPr>
+          <w:rFonts w:ascii="Roboto" w:cs="Roboto" w:eastAsia="Roboto" w:hAnsi="Roboto"/>
           <w:sz w:val="24"/>
           <w:szCs w:val="24"/>
           <w:rtl w:val="0"/>
@@ -120,7 +123,7 @@
       <w:pPr>
         <w:numPr>
           <w:ilvl w:val="0"/>
-          <w:numId w:val="2"/>
+          <w:numId w:val="1"/>
         </w:numPr>
         <w:spacing w:after="0" w:afterAutospacing="0" w:lineRule="auto"/>
         <w:ind w:left="720" w:hanging="360"/>
@@ -140,7 +143,7 @@
       <w:pPr>
         <w:numPr>
           <w:ilvl w:val="0"/>
-          <w:numId w:val="2"/>
+          <w:numId w:val="1"/>
         </w:numPr>
         <w:spacing w:after="0" w:afterAutospacing="0" w:lineRule="auto"/>
         <w:ind w:left="720" w:hanging="360"/>
@@ -160,9 +163,9 @@
       <w:pPr>
         <w:numPr>
           <w:ilvl w:val="0"/>
-          <w:numId w:val="2"/>
+          <w:numId w:val="1"/>
         </w:numPr>
-        <w:spacing w:after="160" w:lineRule="auto"/>
+        <w:spacing w:after="0" w:afterAutospacing="0" w:lineRule="auto"/>
         <w:ind w:left="720" w:hanging="360"/>
       </w:pPr>
       <w:r>
@@ -174,6 +177,71 @@
           <w:rtl w:val="0"/>
         </w:rPr>
         <w:t xml:space="preserve">Provide a framework for model evaluation synthesis</w:t>
+      </w:r>
+    </w:p>
+    <w:p>
+      <w:pPr>
+        <w:numPr>
+          <w:ilvl w:val="0"/>
+          <w:numId w:val="1"/>
+        </w:numPr>
+        <w:shd w:fill="fdfdfd" w:val="clear"/>
+        <w:spacing w:after="120" w:lineRule="auto"/>
+        <w:ind w:left="720" w:hanging="360"/>
+      </w:pPr>
+      <w:r>
+        <w:rPr>
+          <w:rFonts w:ascii="Roboto" w:cs="Roboto" w:eastAsia="Roboto" w:hAnsi="Roboto"/>
+          <w:color w:val="212529"/>
+          <w:sz w:val="24"/>
+          <w:szCs w:val="24"/>
+          <w:rtl w:val="0"/>
+        </w:rPr>
+        <w:t xml:space="preserve">There are many, many</w:t>
+      </w:r>
+      <w:r>
+        <w:rPr>
+          <w:rFonts w:ascii="Roboto" w:cs="Roboto" w:eastAsia="Roboto" w:hAnsi="Roboto"/>
+          <w:sz w:val="24"/>
+          <w:szCs w:val="24"/>
+          <w:rtl w:val="0"/>
+        </w:rPr>
+        <w:t xml:space="preserve"> criteria </w:t>
+      </w:r>
+      <w:r>
+        <w:rPr>
+          <w:rFonts w:ascii="Roboto" w:cs="Roboto" w:eastAsia="Roboto" w:hAnsi="Roboto"/>
+          <w:color w:val="212529"/>
+          <w:sz w:val="24"/>
+          <w:szCs w:val="24"/>
+          <w:rtl w:val="0"/>
+        </w:rPr>
+        <w:t xml:space="preserve">for SDMs. How do we decide what matters to evaluate a</w:t>
+      </w:r>
+      <w:r>
+        <w:rPr>
+          <w:rtl w:val="0"/>
+        </w:rPr>
+        <w:t xml:space="preserve"> model </w:t>
+      </w:r>
+      <w:r>
+        <w:rPr>
+          <w:rFonts w:ascii="Roboto" w:cs="Roboto" w:eastAsia="Roboto" w:hAnsi="Roboto"/>
+          <w:sz w:val="24"/>
+          <w:szCs w:val="24"/>
+          <w:rtl w:val="0"/>
+        </w:rPr>
+        <w:t xml:space="preserve">for a specific model application</w:t>
+      </w:r>
+      <w:r>
+        <w:rPr>
+          <w:rFonts w:ascii="Roboto" w:cs="Roboto" w:eastAsia="Roboto" w:hAnsi="Roboto"/>
+          <w:color w:val="212529"/>
+          <w:sz w:val="24"/>
+          <w:szCs w:val="24"/>
+          <w:rtl w:val="0"/>
+        </w:rPr>
+        <w:t xml:space="preserve">?</w:t>
       </w:r>
     </w:p>
     <w:p>
@@ -218,18 +286,16 @@
           <w:szCs w:val="24"/>
           <w:rtl w:val="0"/>
         </w:rPr>
-        <w:t xml:space="preserve">There are many, many </w:t>
-      </w:r>
-      <w:r>
-        <w:rPr>
-          <w:rFonts w:ascii="Roboto" w:cs="Roboto" w:eastAsia="Roboto" w:hAnsi="Roboto"/>
-          <w:color w:val="2980b9"/>
-          <w:sz w:val="24"/>
-          <w:szCs w:val="24"/>
-          <w:u w:val="single"/>
-          <w:rtl w:val="0"/>
-        </w:rPr>
-        <w:t xml:space="preserve">criteria</w:t>
+        <w:t xml:space="preserve">This is a workflow and user-friendly tool for filtering model criteria, identifying those essential for the intended</w:t>
+      </w:r>
+      <w:r>
+        <w:rPr>
+          <w:rFonts w:ascii="Roboto" w:cs="Roboto" w:eastAsia="Roboto" w:hAnsi="Roboto"/>
+          <w:sz w:val="24"/>
+          <w:szCs w:val="24"/>
+          <w:rtl w:val="0"/>
+        </w:rPr>
+        <w:t xml:space="preserve"> model application, so that both modelers and end-users can </w:t>
       </w:r>
       <w:r>
         <w:rPr>
@@ -239,113 +305,28 @@
           <w:szCs w:val="24"/>
           <w:rtl w:val="0"/>
         </w:rPr>
-        <w:t xml:space="preserve"> for SDMs. How do we decide what matters to evaluate a </w:t>
-      </w:r>
-      <w:r>
-        <w:rPr>
-          <w:rFonts w:ascii="Roboto" w:cs="Roboto" w:eastAsia="Roboto" w:hAnsi="Roboto"/>
-          <w:color w:val="2980b9"/>
-          <w:sz w:val="24"/>
-          <w:szCs w:val="24"/>
-          <w:u w:val="single"/>
-          <w:rtl w:val="0"/>
-        </w:rPr>
-        <w:t xml:space="preserve">model</w:t>
-      </w:r>
-      <w:r>
-        <w:rPr>
-          <w:rFonts w:ascii="Roboto" w:cs="Roboto" w:eastAsia="Roboto" w:hAnsi="Roboto"/>
-          <w:color w:val="212529"/>
-          <w:sz w:val="24"/>
-          <w:szCs w:val="24"/>
-          <w:rtl w:val="0"/>
-        </w:rPr>
-        <w:t xml:space="preserve">?</w:t>
-      </w:r>
-    </w:p>
-    <w:p>
-      <w:pPr>
+        <w:t xml:space="preserve">differentiate wrong from useful.</w:t>
+      </w:r>
+    </w:p>
+    <w:p>
+      <w:pPr>
+        <w:pStyle w:val="Heading4"/>
         <w:shd w:fill="fdfdfd" w:val="clear"/>
         <w:spacing w:after="120" w:lineRule="auto"/>
         <w:rPr>
           <w:rFonts w:ascii="Roboto" w:cs="Roboto" w:eastAsia="Roboto" w:hAnsi="Roboto"/>
-          <w:color w:val="212529"/>
-          <w:sz w:val="24"/>
-          <w:szCs w:val="24"/>
-        </w:rPr>
-      </w:pPr>
-      <w:r>
-        <w:rPr>
-          <w:rFonts w:ascii="Roboto" w:cs="Roboto" w:eastAsia="Roboto" w:hAnsi="Roboto"/>
-          <w:color w:val="212529"/>
-          <w:sz w:val="24"/>
-          <w:szCs w:val="24"/>
-          <w:rtl w:val="0"/>
-        </w:rPr>
-        <w:t xml:space="preserve">-This is a workflow and user-friendly tool for filtering model criteria, identifying those essential for the intended </w:t>
-      </w:r>
-      <w:r>
-        <w:rPr>
-          <w:rFonts w:ascii="Roboto" w:cs="Roboto" w:eastAsia="Roboto" w:hAnsi="Roboto"/>
-          <w:color w:val="2980b9"/>
-          <w:sz w:val="24"/>
-          <w:szCs w:val="24"/>
-          <w:u w:val="single"/>
-          <w:rtl w:val="0"/>
-        </w:rPr>
-        <w:t xml:space="preserve">model application,</w:t>
-      </w:r>
-      <w:r>
-        <w:rPr>
-          <w:rFonts w:ascii="Roboto" w:cs="Roboto" w:eastAsia="Roboto" w:hAnsi="Roboto"/>
-          <w:color w:val="212529"/>
-          <w:sz w:val="24"/>
-          <w:szCs w:val="24"/>
-          <w:rtl w:val="0"/>
-        </w:rPr>
-        <w:t xml:space="preserve"> so that both </w:t>
-      </w:r>
-      <w:r>
-        <w:rPr>
-          <w:rFonts w:ascii="Roboto" w:cs="Roboto" w:eastAsia="Roboto" w:hAnsi="Roboto"/>
-          <w:color w:val="2980b9"/>
-          <w:sz w:val="24"/>
-          <w:szCs w:val="24"/>
-          <w:u w:val="single"/>
-          <w:rtl w:val="0"/>
-        </w:rPr>
-        <w:t xml:space="preserve">modelers</w:t>
-      </w:r>
-      <w:r>
-        <w:rPr>
-          <w:rFonts w:ascii="Roboto" w:cs="Roboto" w:eastAsia="Roboto" w:hAnsi="Roboto"/>
-          <w:color w:val="212529"/>
-          <w:sz w:val="24"/>
-          <w:szCs w:val="24"/>
-          <w:rtl w:val="0"/>
-        </w:rPr>
-        <w:t xml:space="preserve"> and </w:t>
-      </w:r>
-      <w:r>
-        <w:rPr>
-          <w:rFonts w:ascii="Roboto" w:cs="Roboto" w:eastAsia="Roboto" w:hAnsi="Roboto"/>
-          <w:color w:val="2980b9"/>
-          <w:sz w:val="24"/>
-          <w:szCs w:val="24"/>
-          <w:u w:val="single"/>
-          <w:rtl w:val="0"/>
-        </w:rPr>
-        <w:t xml:space="preserve">end-users</w:t>
-      </w:r>
-      <w:r>
-        <w:rPr>
-          <w:rFonts w:ascii="Roboto" w:cs="Roboto" w:eastAsia="Roboto" w:hAnsi="Roboto"/>
-          <w:color w:val="212529"/>
-          <w:sz w:val="24"/>
-          <w:szCs w:val="24"/>
-          <w:rtl w:val="0"/>
-        </w:rPr>
-        <w:t xml:space="preserve"> can differentiate wrong from useful.</w:t>
+          <w:color w:val="351c75"/>
+        </w:rPr>
+      </w:pPr>
+      <w:bookmarkStart w:colFirst="0" w:colLast="0" w:name="_qujqpe9qcigb" w:id="5"/>
+      <w:bookmarkEnd w:id="5"/>
+      <w:r>
+        <w:rPr>
+          <w:rFonts w:ascii="Roboto" w:cs="Roboto" w:eastAsia="Roboto" w:hAnsi="Roboto"/>
+          <w:color w:val="351c75"/>
+          <w:rtl w:val="0"/>
+        </w:rPr>
+        <w:t xml:space="preserve">How to proceed?</w:t>
       </w:r>
     </w:p>
     <w:p>
@@ -367,266 +348,263 @@
           <w:szCs w:val="24"/>
           <w:rtl w:val="0"/>
         </w:rPr>
-        <w:t xml:space="preserve">-These are the steps that an end-user should take to narrow down what are the criteria that might be more significant to evaluate the reliability of the model for a specific model application.</w:t>
-      </w:r>
-    </w:p>
-    <w:p>
-      <w:pPr>
-        <w:shd w:fill="e8f4f8" w:val="clear"/>
-        <w:spacing w:after="120" w:before="160" w:lineRule="auto"/>
-        <w:rPr>
-          <w:rFonts w:ascii="Roboto" w:cs="Roboto" w:eastAsia="Roboto" w:hAnsi="Roboto"/>
-          <w:color w:val="212529"/>
-          <w:sz w:val="24"/>
-          <w:szCs w:val="24"/>
-        </w:rPr>
-      </w:pPr>
-      <w:r>
-        <w:rPr>
-          <w:rFonts w:ascii="Roboto" w:cs="Roboto" w:eastAsia="Roboto" w:hAnsi="Roboto"/>
-          <w:color w:val="212529"/>
-          <w:sz w:val="24"/>
-          <w:szCs w:val="24"/>
-          <w:rtl w:val="0"/>
-        </w:rPr>
-        <w:t xml:space="preserve">1.</w:t>
-      </w:r>
+        <w:t xml:space="preserve">Follow these steps to identify the most significant criteria for evaluating model reliability and utility for a specific model application.</w:t>
+      </w:r>
+    </w:p>
+    <w:p>
+      <w:pPr>
+        <w:ind w:left="0" w:firstLine="0"/>
+        <w:rPr>
+          <w:rFonts w:ascii="Roboto" w:cs="Roboto" w:eastAsia="Roboto" w:hAnsi="Roboto"/>
+          <w:sz w:val="24"/>
+          <w:szCs w:val="24"/>
+        </w:rPr>
+      </w:pPr>
       <w:r>
         <w:rPr>
           <w:rFonts w:ascii="Roboto" w:cs="Roboto" w:eastAsia="Roboto" w:hAnsi="Roboto"/>
           <w:b w:val="1"/>
           <w:bCs w:val="1"/>
-          <w:color w:val="212529"/>
-          <w:sz w:val="24"/>
-          <w:szCs w:val="24"/>
-          <w:rtl w:val="0"/>
-        </w:rPr>
-        <w:t xml:space="preserve">Select the </w:t>
+          <w:sz w:val="24"/>
+          <w:szCs w:val="24"/>
+          <w:rtl w:val="0"/>
+        </w:rPr>
+        <w:t xml:space="preserve">1. </w:t>
       </w:r>
       <w:r>
         <w:rPr>
           <w:rFonts w:ascii="Roboto" w:cs="Roboto" w:eastAsia="Roboto" w:hAnsi="Roboto"/>
           <w:b w:val="1"/>
           <w:bCs w:val="1"/>
-          <w:color w:val="2980b9"/>
-          <w:sz w:val="24"/>
-          <w:szCs w:val="24"/>
-          <w:u w:val="single"/>
-          <w:rtl w:val="0"/>
-        </w:rPr>
-        <w:t xml:space="preserve">model</w:t>
-      </w:r>
-      <w:r>
+          <w:sz w:val="24"/>
+          <w:szCs w:val="24"/>
+          <w:rtl w:val="0"/>
+        </w:rPr>
+        <w:t xml:space="preserve">Select the model application</w:t>
+      </w:r>
+      <w:r>
+        <w:rPr>
+          <w:rFonts w:ascii="Roboto" w:cs="Roboto" w:eastAsia="Roboto" w:hAnsi="Roboto"/>
+          <w:sz w:val="24"/>
+          <w:szCs w:val="24"/>
+          <w:rtl w:val="0"/>
+        </w:rPr>
+        <w:t xml:space="preserve">:</w:t>
+      </w:r>
+    </w:p>
+    <w:p>
+      <w:pPr>
+        <w:jc w:val="both"/>
+        <w:rPr>
+          <w:rFonts w:ascii="Roboto" w:cs="Roboto" w:eastAsia="Roboto" w:hAnsi="Roboto"/>
+          <w:sz w:val="24"/>
+          <w:szCs w:val="24"/>
+        </w:rPr>
+      </w:pPr>
+      <w:r>
+        <w:rPr>
+          <w:rFonts w:ascii="Roboto" w:cs="Roboto" w:eastAsia="Roboto" w:hAnsi="Roboto"/>
+          <w:sz w:val="24"/>
+          <w:szCs w:val="24"/>
+          <w:rtl w:val="0"/>
+        </w:rPr>
+        <w:t xml:space="preserve">There is a comprehensive inventory of SDMs applications organized in broad primary categories and specific subcategories. Choose the best category/subcategory that accommodates your needs.</w:t>
+      </w:r>
+    </w:p>
+    <w:p>
+      <w:pPr>
+        <w:ind w:left="0" w:firstLine="0"/>
         <w:rPr>
           <w:rFonts w:ascii="Roboto" w:cs="Roboto" w:eastAsia="Roboto" w:hAnsi="Roboto"/>
           <w:b w:val="1"/>
           <w:bCs w:val="1"/>
-          <w:color w:val="212529"/>
-          <w:sz w:val="24"/>
-          <w:szCs w:val="24"/>
-          <w:rtl w:val="0"/>
-        </w:rPr>
-        <w:t xml:space="preserve"> application</w:t>
-      </w:r>
-      <w:r>
-        <w:rPr>
-          <w:rFonts w:ascii="Roboto" w:cs="Roboto" w:eastAsia="Roboto" w:hAnsi="Roboto"/>
-          <w:color w:val="212529"/>
-          <w:sz w:val="24"/>
-          <w:szCs w:val="24"/>
-          <w:rtl w:val="0"/>
-        </w:rPr>
-        <w:t xml:space="preserve">: there is a comprehensive inventory of SDMs applications organized in broad primary categories and specific subcategories. Choose the best category/subcategory that accommodates your needs.</w:t>
-      </w:r>
-    </w:p>
-    <w:p>
-      <w:pPr>
-        <w:shd w:fill="e8f4f8" w:val="clear"/>
-        <w:spacing w:after="120" w:before="160" w:lineRule="auto"/>
-        <w:rPr>
-          <w:rFonts w:ascii="Roboto" w:cs="Roboto" w:eastAsia="Roboto" w:hAnsi="Roboto"/>
-          <w:color w:val="212529"/>
-          <w:sz w:val="24"/>
-          <w:szCs w:val="24"/>
-        </w:rPr>
-      </w:pPr>
-      <w:r>
-        <w:rPr>
-          <w:rFonts w:ascii="Roboto" w:cs="Roboto" w:eastAsia="Roboto" w:hAnsi="Roboto"/>
-          <w:color w:val="212529"/>
-          <w:sz w:val="24"/>
-          <w:szCs w:val="24"/>
-          <w:rtl w:val="0"/>
-        </w:rPr>
-        <w:t xml:space="preserve">2.</w:t>
-      </w:r>
+          <w:sz w:val="24"/>
+          <w:szCs w:val="24"/>
+        </w:rPr>
+      </w:pPr>
+      <w:r>
+        <w:rPr>
+          <w:rtl w:val="0"/>
+        </w:rPr>
+      </w:r>
+    </w:p>
+    <w:p>
+      <w:pPr>
+        <w:ind w:left="0" w:firstLine="0"/>
+        <w:rPr>
+          <w:rFonts w:ascii="Roboto" w:cs="Roboto" w:eastAsia="Roboto" w:hAnsi="Roboto"/>
+          <w:sz w:val="24"/>
+          <w:szCs w:val="24"/>
+        </w:rPr>
+      </w:pPr>
       <w:r>
         <w:rPr>
           <w:rFonts w:ascii="Roboto" w:cs="Roboto" w:eastAsia="Roboto" w:hAnsi="Roboto"/>
           <w:b w:val="1"/>
           <w:bCs w:val="1"/>
-          <w:color w:val="212529"/>
-          <w:sz w:val="24"/>
-          <w:szCs w:val="24"/>
-          <w:rtl w:val="0"/>
-        </w:rPr>
-        <w:t xml:space="preserve">Select </w:t>
-      </w:r>
+          <w:sz w:val="24"/>
+          <w:szCs w:val="24"/>
+          <w:rtl w:val="0"/>
+        </w:rPr>
+        <w:t xml:space="preserve">2. Select Model Type</w:t>
+      </w:r>
+      <w:r>
+        <w:rPr>
+          <w:rFonts w:ascii="Roboto" w:cs="Roboto" w:eastAsia="Roboto" w:hAnsi="Roboto"/>
+          <w:sz w:val="24"/>
+          <w:szCs w:val="24"/>
+          <w:rtl w:val="0"/>
+        </w:rPr>
+        <w:t xml:space="preserve">:</w:t>
+      </w:r>
+    </w:p>
+    <w:p>
+      <w:pPr>
+        <w:jc w:val="both"/>
+        <w:rPr>
+          <w:rFonts w:ascii="Roboto" w:cs="Roboto" w:eastAsia="Roboto" w:hAnsi="Roboto"/>
+          <w:sz w:val="24"/>
+          <w:szCs w:val="24"/>
+        </w:rPr>
+      </w:pPr>
+      <w:r>
+        <w:rPr>
+          <w:rFonts w:ascii="Roboto" w:cs="Roboto" w:eastAsia="Roboto" w:hAnsi="Roboto"/>
+          <w:sz w:val="24"/>
+          <w:szCs w:val="24"/>
+          <w:rtl w:val="0"/>
+        </w:rPr>
+        <w:t xml:space="preserve">These are entry level operational categories that describe the general purpose of the model. Once you have selected the model application and model type, a description will be displayed in Tab2 (Selected Application Context).</w:t>
+      </w:r>
+    </w:p>
+    <w:p>
+      <w:pPr>
+        <w:ind w:left="0" w:firstLine="0"/>
+        <w:rPr>
+          <w:rFonts w:ascii="Roboto" w:cs="Roboto" w:eastAsia="Roboto" w:hAnsi="Roboto"/>
+          <w:sz w:val="24"/>
+          <w:szCs w:val="24"/>
+        </w:rPr>
+      </w:pPr>
+      <w:r>
+        <w:rPr>
+          <w:rtl w:val="0"/>
+        </w:rPr>
+      </w:r>
+    </w:p>
+    <w:p>
+      <w:pPr>
+        <w:ind w:left="0" w:firstLine="0"/>
+        <w:rPr>
+          <w:rFonts w:ascii="Roboto" w:cs="Roboto" w:eastAsia="Roboto" w:hAnsi="Roboto"/>
+          <w:sz w:val="24"/>
+          <w:szCs w:val="24"/>
+        </w:rPr>
+      </w:pPr>
       <w:r>
         <w:rPr>
           <w:rFonts w:ascii="Roboto" w:cs="Roboto" w:eastAsia="Roboto" w:hAnsi="Roboto"/>
           <w:b w:val="1"/>
           <w:bCs w:val="1"/>
-          <w:color w:val="2980b9"/>
-          <w:sz w:val="24"/>
-          <w:szCs w:val="24"/>
-          <w:u w:val="single"/>
-          <w:rtl w:val="0"/>
-        </w:rPr>
-        <w:t xml:space="preserve">Model Type</w:t>
-      </w:r>
-      <w:r>
-        <w:rPr>
-          <w:rFonts w:ascii="Roboto" w:cs="Roboto" w:eastAsia="Roboto" w:hAnsi="Roboto"/>
-          <w:color w:val="212529"/>
-          <w:sz w:val="24"/>
-          <w:szCs w:val="24"/>
-          <w:rtl w:val="0"/>
-        </w:rPr>
-        <w:t xml:space="preserve">: these are entry level operational categories that describe the general purpose of the model.</w:t>
-      </w:r>
-    </w:p>
-    <w:p>
-      <w:pPr>
-        <w:numPr>
-          <w:ilvl w:val="0"/>
-          <w:numId w:val="1"/>
-        </w:numPr>
-        <w:shd w:fill="e8f4f8" w:val="clear"/>
-        <w:spacing w:after="120" w:before="160" w:lineRule="auto"/>
-        <w:ind w:left="720" w:hanging="360"/>
-        <w:rPr>
-          <w:u w:val="none"/>
-        </w:rPr>
-      </w:pPr>
-      <w:r>
-        <w:rPr>
-          <w:rFonts w:ascii="Roboto" w:cs="Roboto" w:eastAsia="Roboto" w:hAnsi="Roboto"/>
-          <w:color w:val="212529"/>
-          <w:sz w:val="24"/>
-          <w:szCs w:val="24"/>
-          <w:rtl w:val="0"/>
-        </w:rPr>
-        <w:t xml:space="preserve">Once you have selected the model application and model type, a description will be displayed in Tab2 (Selected Application Context, and in Tab3 (Application criteria) you will see the </w:t>
-      </w:r>
-      <w:r>
-        <w:rPr>
-          <w:rtl w:val="0"/>
-        </w:rPr>
-        <w:t xml:space="preserve">Model Outcome Performance &amp; Risk suggested for the model application you have selected. Then you can proceed to Step 3.</w:t>
-      </w:r>
-      <w:r>
-        <w:rPr>
-          <w:rtl w:val="0"/>
-        </w:rPr>
-      </w:r>
-    </w:p>
-    <w:p>
-      <w:pPr>
-        <w:shd w:fill="e8f4f8" w:val="clear"/>
-        <w:spacing w:after="120" w:before="160" w:lineRule="auto"/>
-        <w:rPr>
-          <w:rFonts w:ascii="Roboto" w:cs="Roboto" w:eastAsia="Roboto" w:hAnsi="Roboto"/>
-          <w:color w:val="212529"/>
-          <w:sz w:val="24"/>
-          <w:szCs w:val="24"/>
-        </w:rPr>
-      </w:pPr>
-      <w:r>
-        <w:rPr>
-          <w:rFonts w:ascii="Roboto" w:cs="Roboto" w:eastAsia="Roboto" w:hAnsi="Roboto"/>
-          <w:color w:val="212529"/>
-          <w:sz w:val="24"/>
-          <w:szCs w:val="24"/>
-          <w:rtl w:val="0"/>
-        </w:rPr>
-        <w:t xml:space="preserve">3.</w:t>
-      </w:r>
-      <w:r>
+          <w:sz w:val="24"/>
+          <w:szCs w:val="24"/>
+          <w:rtl w:val="0"/>
+        </w:rPr>
+        <w:t xml:space="preserve">3. Select the model performance outcome and the risk tolerance</w:t>
+      </w:r>
+      <w:r>
+        <w:rPr>
+          <w:rFonts w:ascii="Roboto" w:cs="Roboto" w:eastAsia="Roboto" w:hAnsi="Roboto"/>
+          <w:sz w:val="24"/>
+          <w:szCs w:val="24"/>
+          <w:rtl w:val="0"/>
+        </w:rPr>
+        <w:t xml:space="preserve">: </w:t>
+      </w:r>
+    </w:p>
+    <w:p>
+      <w:pPr>
+        <w:jc w:val="both"/>
+        <w:rPr>
+          <w:rFonts w:ascii="Roboto" w:cs="Roboto" w:eastAsia="Roboto" w:hAnsi="Roboto"/>
+          <w:sz w:val="24"/>
+          <w:szCs w:val="24"/>
+        </w:rPr>
+      </w:pPr>
+      <w:r>
+        <w:rPr>
+          <w:rFonts w:ascii="Roboto" w:cs="Roboto" w:eastAsia="Roboto" w:hAnsi="Roboto"/>
+          <w:sz w:val="24"/>
+          <w:szCs w:val="24"/>
+          <w:rtl w:val="0"/>
+        </w:rPr>
+        <w:t xml:space="preserve">Decide whether Omission errors or/and Commission errors carry heavier consequences. Then select the 'risk level' that dictates which type of error you are willing to tolerate. Once you have selected the performance outcome and the risk tolerance, a list of model criteria will be displayed in Tab3 (Applicable Criteria).</w:t>
+      </w:r>
+    </w:p>
+    <w:p>
+      <w:pPr>
+        <w:ind w:left="0" w:firstLine="0"/>
         <w:rPr>
           <w:rFonts w:ascii="Roboto" w:cs="Roboto" w:eastAsia="Roboto" w:hAnsi="Roboto"/>
           <w:b w:val="1"/>
           <w:bCs w:val="1"/>
-          <w:color w:val="212529"/>
-          <w:sz w:val="24"/>
-          <w:szCs w:val="24"/>
-          <w:rtl w:val="0"/>
-        </w:rPr>
-        <w:t xml:space="preserve">Select the model performance outcome and the risk tolerance</w:t>
-      </w:r>
-      <w:r>
-        <w:rPr>
-          <w:rFonts w:ascii="Roboto" w:cs="Roboto" w:eastAsia="Roboto" w:hAnsi="Roboto"/>
-          <w:color w:val="212529"/>
-          <w:sz w:val="24"/>
-          <w:szCs w:val="24"/>
-          <w:rtl w:val="0"/>
-        </w:rPr>
-        <w:t xml:space="preserve">: decide whether Omission or/and </w:t>
-      </w:r>
-      <w:r>
-        <w:rPr>
-          <w:rFonts w:ascii="Roboto" w:cs="Roboto" w:eastAsia="Roboto" w:hAnsi="Roboto"/>
-          <w:color w:val="2980b9"/>
-          <w:sz w:val="24"/>
-          <w:szCs w:val="24"/>
-          <w:u w:val="single"/>
-          <w:rtl w:val="0"/>
-        </w:rPr>
-        <w:t xml:space="preserve">Commission errors</w:t>
-      </w:r>
-      <w:r>
-        <w:rPr>
-          <w:rFonts w:ascii="Roboto" w:cs="Roboto" w:eastAsia="Roboto" w:hAnsi="Roboto"/>
-          <w:color w:val="212529"/>
-          <w:sz w:val="24"/>
-          <w:szCs w:val="24"/>
-          <w:rtl w:val="0"/>
-        </w:rPr>
-        <w:t xml:space="preserve"> carry heavier consequences. Then select the '</w:t>
-      </w:r>
-      <w:r>
-        <w:rPr>
-          <w:rFonts w:ascii="Roboto" w:cs="Roboto" w:eastAsia="Roboto" w:hAnsi="Roboto"/>
-          <w:color w:val="2980b9"/>
-          <w:sz w:val="24"/>
-          <w:szCs w:val="24"/>
-          <w:u w:val="single"/>
-          <w:rtl w:val="0"/>
-        </w:rPr>
-        <w:t xml:space="preserve">risk level</w:t>
-      </w:r>
-      <w:r>
-        <w:rPr>
-          <w:rFonts w:ascii="Roboto" w:cs="Roboto" w:eastAsia="Roboto" w:hAnsi="Roboto"/>
-          <w:color w:val="212529"/>
-          <w:sz w:val="24"/>
-          <w:szCs w:val="24"/>
-          <w:rtl w:val="0"/>
-        </w:rPr>
-        <w:t xml:space="preserve">' that dictates which type of error you are willing to tolerate.</w:t>
-      </w:r>
-    </w:p>
-    <w:p>
-      <w:pPr>
-        <w:shd w:fill="e8f4f8" w:val="clear"/>
-        <w:spacing w:after="120" w:before="160" w:lineRule="auto"/>
-        <w:rPr/>
-      </w:pPr>
-      <w:r>
-        <w:rPr>
-          <w:rtl w:val="0"/>
-        </w:rPr>
+          <w:sz w:val="24"/>
+          <w:szCs w:val="24"/>
+        </w:rPr>
+      </w:pPr>
+      <w:r>
+        <w:rPr>
+          <w:rtl w:val="0"/>
+        </w:rPr>
+      </w:r>
+    </w:p>
+    <w:p>
+      <w:pPr>
+        <w:ind w:left="0" w:firstLine="0"/>
+        <w:rPr>
+          <w:rFonts w:ascii="Roboto" w:cs="Roboto" w:eastAsia="Roboto" w:hAnsi="Roboto"/>
+          <w:sz w:val="24"/>
+          <w:szCs w:val="24"/>
+        </w:rPr>
+      </w:pPr>
+      <w:r>
+        <w:rPr>
+          <w:rFonts w:ascii="Roboto" w:cs="Roboto" w:eastAsia="Roboto" w:hAnsi="Roboto"/>
+          <w:b w:val="1"/>
+          <w:bCs w:val="1"/>
+          <w:sz w:val="24"/>
+          <w:szCs w:val="24"/>
+          <w:rtl w:val="0"/>
+        </w:rPr>
+        <w:t xml:space="preserve">4. Generate and export your report</w:t>
+      </w:r>
+      <w:r>
+        <w:rPr>
+          <w:rFonts w:ascii="Roboto" w:cs="Roboto" w:eastAsia="Roboto" w:hAnsi="Roboto"/>
+          <w:sz w:val="24"/>
+          <w:szCs w:val="24"/>
+          <w:rtl w:val="0"/>
+        </w:rPr>
+        <w:t xml:space="preserve">:</w:t>
+      </w:r>
+    </w:p>
+    <w:p>
+      <w:pPr>
+        <w:jc w:val="both"/>
+        <w:rPr>
+          <w:rFonts w:ascii="Roboto" w:cs="Roboto" w:eastAsia="Roboto" w:hAnsi="Roboto"/>
+          <w:sz w:val="24"/>
+          <w:szCs w:val="24"/>
+        </w:rPr>
+      </w:pPr>
+      <w:r>
+        <w:rPr>
+          <w:rFonts w:ascii="Roboto" w:cs="Roboto" w:eastAsia="Roboto" w:hAnsi="Roboto"/>
+          <w:sz w:val="24"/>
+          <w:szCs w:val="24"/>
+          <w:rtl w:val="0"/>
+        </w:rPr>
+        <w:t xml:space="preserve">Your selected configurations and results will be compiled in Tab 4. You can download this summary in either .doc or .csv format. Use the dedicated fields in Tab 1 and Tab 2 to provide details about your case study. This information allows the app to generate a more customized and meaningful report.</w:t>
       </w:r>
     </w:p>
     <w:sectPr>
@@ -650,116 +628,6 @@
         <w:ind w:left="720" w:hanging="360"/>
       </w:pPr>
       <w:rPr>
-        <w:u w:val="none"/>
-      </w:rPr>
-    </w:lvl>
-    <w:lvl w:ilvl="1">
-      <w:start w:val="1"/>
-      <w:numFmt w:val="bullet"/>
-      <w:lvlText w:val="○"/>
-      <w:lvlJc w:val="left"/>
-      <w:pPr>
-        <w:ind w:left="1440" w:hanging="360"/>
-      </w:pPr>
-      <w:rPr>
-        <w:u w:val="none"/>
-      </w:rPr>
-    </w:lvl>
-    <w:lvl w:ilvl="2">
-      <w:start w:val="1"/>
-      <w:numFmt w:val="bullet"/>
-      <w:lvlText w:val="■"/>
-      <w:lvlJc w:val="left"/>
-      <w:pPr>
-        <w:ind w:left="2160" w:hanging="360"/>
-      </w:pPr>
-      <w:rPr>
-        <w:u w:val="none"/>
-      </w:rPr>
-    </w:lvl>
-    <w:lvl w:ilvl="3">
-      <w:start w:val="1"/>
-      <w:numFmt w:val="bullet"/>
-      <w:lvlText w:val="●"/>
-      <w:lvlJc w:val="left"/>
-      <w:pPr>
-        <w:ind w:left="2880" w:hanging="360"/>
-      </w:pPr>
-      <w:rPr>
-        <w:u w:val="none"/>
-      </w:rPr>
-    </w:lvl>
-    <w:lvl w:ilvl="4">
-      <w:start w:val="1"/>
-      <w:numFmt w:val="bullet"/>
-      <w:lvlText w:val="○"/>
-      <w:lvlJc w:val="left"/>
-      <w:pPr>
-        <w:ind w:left="3600" w:hanging="360"/>
-      </w:pPr>
-      <w:rPr>
-        <w:u w:val="none"/>
-      </w:rPr>
-    </w:lvl>
-    <w:lvl w:ilvl="5">
-      <w:start w:val="1"/>
-      <w:numFmt w:val="bullet"/>
-      <w:lvlText w:val="■"/>
-      <w:lvlJc w:val="left"/>
-      <w:pPr>
-        <w:ind w:left="4320" w:hanging="360"/>
-      </w:pPr>
-      <w:rPr>
-        <w:u w:val="none"/>
-      </w:rPr>
-    </w:lvl>
-    <w:lvl w:ilvl="6">
-      <w:start w:val="1"/>
-      <w:numFmt w:val="bullet"/>
-      <w:lvlText w:val="●"/>
-      <w:lvlJc w:val="left"/>
-      <w:pPr>
-        <w:ind w:left="5040" w:hanging="360"/>
-      </w:pPr>
-      <w:rPr>
-        <w:u w:val="none"/>
-      </w:rPr>
-    </w:lvl>
-    <w:lvl w:ilvl="7">
-      <w:start w:val="1"/>
-      <w:numFmt w:val="bullet"/>
-      <w:lvlText w:val="○"/>
-      <w:lvlJc w:val="left"/>
-      <w:pPr>
-        <w:ind w:left="5760" w:hanging="360"/>
-      </w:pPr>
-      <w:rPr>
-        <w:u w:val="none"/>
-      </w:rPr>
-    </w:lvl>
-    <w:lvl w:ilvl="8">
-      <w:start w:val="1"/>
-      <w:numFmt w:val="bullet"/>
-      <w:lvlText w:val="■"/>
-      <w:lvlJc w:val="left"/>
-      <w:pPr>
-        <w:ind w:left="6480" w:hanging="360"/>
-      </w:pPr>
-      <w:rPr>
-        <w:u w:val="none"/>
-      </w:rPr>
-    </w:lvl>
-  </w:abstractNum>
-  <w:abstractNum w:abstractNumId="2">
-    <w:lvl w:ilvl="0">
-      <w:start w:val="1"/>
-      <w:numFmt w:val="bullet"/>
-      <w:lvlText w:val="●"/>
-      <w:lvlJc w:val="left"/>
-      <w:pPr>
-        <w:ind w:left="720" w:hanging="360"/>
-      </w:pPr>
-      <w:rPr>
         <w:rFonts w:ascii="Roboto" w:cs="Roboto" w:eastAsia="Roboto" w:hAnsi="Roboto"/>
         <w:color w:val="212529"/>
         <w:sz w:val="24"/>
@@ -866,9 +734,6 @@
   </w:abstractNum>
   <w:num w:numId="1">
     <w:abstractNumId w:val="1"/>
-  </w:num>
-  <w:num w:numId="2">
-    <w:abstractNumId w:val="2"/>
   </w:num>
 </w:numbering>
 </file>

</xml_diff>